<commit_message>
added link to github repo to ODD protocol
</commit_message>
<xml_diff>
--- a/ODD_protocol.docx
+++ b/ODD_protocol.docx
@@ -1615,6 +1615,7 @@
           <w:color w:val="000000" w:themeColor="text1"/>
           <w:lang w:val="en-US"/>
         </w:rPr>
+        <w:lastRenderedPageBreak/>
         <w:t>d</w:t>
       </w:r>
       <w:r>
@@ -1736,7 +1737,6 @@
           <w:color w:val="000000" w:themeColor="text1"/>
           <w:lang w:val="en-US"/>
         </w:rPr>
-        <w:lastRenderedPageBreak/>
         <w:t>2.3 Environment</w:t>
       </w:r>
     </w:p>
@@ -2876,6 +2876,7 @@
           <w:color w:val="000000" w:themeColor="text1"/>
           <w:lang w:val="en-US"/>
         </w:rPr>
+        <w:lastRenderedPageBreak/>
         <w:t>There are direct interactions between agents who are located in the same cell or in the neighboring cell. The interactions determine the probability of disease transmission.</w:t>
       </w:r>
     </w:p>
@@ -2903,7 +2904,6 @@
           <w:szCs w:val="26"/>
           <w:lang w:val="en-US"/>
         </w:rPr>
-        <w:lastRenderedPageBreak/>
         <w:t>4.</w:t>
       </w:r>
       <w:r>
@@ -4161,6 +4161,7 @@
           <w:color w:val="000000" w:themeColor="text1"/>
           <w:lang w:val="en-US"/>
         </w:rPr>
+        <w:lastRenderedPageBreak/>
         <w:t>The health ministry activates</w:t>
       </w:r>
       <w:r>
@@ -4636,6 +4637,39 @@
       </w:rPr>
       <w:t>26176340</w:t>
     </w:r>
+  </w:p>
+  <w:p>
+    <w:pPr>
+      <w:pStyle w:val="En-tte"/>
+      <w:rPr>
+        <w:rFonts w:ascii="Times New Roman" w:hAnsi="Times New Roman" w:cs="Times New Roman"/>
+        <w:lang w:val="de-DE"/>
+      </w:rPr>
+    </w:pPr>
+    <w:r>
+      <w:rPr>
+        <w:rFonts w:ascii="Times New Roman" w:hAnsi="Times New Roman" w:cs="Times New Roman"/>
+        <w:lang w:val="de-DE"/>
+      </w:rPr>
+      <w:t>Lin</w:t>
+    </w:r>
+    <w:r>
+      <w:rPr>
+        <w:rFonts w:ascii="Times New Roman" w:hAnsi="Times New Roman" w:cs="Times New Roman"/>
+        <w:lang w:val="de-DE"/>
+      </w:rPr>
+      <w:t xml:space="preserve">k to the GitHub repository : </w:t>
+    </w:r>
+    <w:hyperlink r:id="rId1" w:history="1">
+      <w:r>
+        <w:rPr>
+          <w:rStyle w:val="Lienhypertexte"/>
+          <w:rFonts w:ascii="Times New Roman" w:hAnsi="Times New Roman" w:cs="Times New Roman"/>
+          <w:lang w:val="de-DE"/>
+        </w:rPr>
+        <w:t>click here</w:t>
+      </w:r>
+    </w:hyperlink>
   </w:p>
 </w:hdr>
 </file>

</xml_diff>